<commit_message>
docs(site): publish real backend screenshots
</commit_message>
<xml_diff>
--- a/operations-requirements/downloads/00_总纲与研发分工 PRD.docx
+++ b/operations-requirements/downloads/00_总纲与研发分工 PRD.docx
@@ -72,6 +72,68 @@
     <w:p>
       <w:r>
         <w:t>每个功能模块使用独立PRD。研发拆分不得只依据原型页面；必须同时实现字段规格、操作流程、状态机、权限、跨端规则、异常处理和验收条件。</w:t>
+      </w:r>
+    </w:p>
+    <w:p>
+      <w:pPr>
+        <w:pStyle w:val="Heading2"/>
+      </w:pPr>
+      <w:r>
+        <w:t>1.1 原型界面依据</w:t>
+      </w:r>
+    </w:p>
+    <w:p>
+      <w:r>
+        <w:t>以下截图直接取自 AiwaBot产品原型-v3.2.html，用于核对页面布局、入口、字段和操作位置。</w:t>
+      </w:r>
+    </w:p>
+    <w:p>
+      <w:pPr>
+        <w:keepNext/>
+        <w:jc w:val="center"/>
+      </w:pPr>
+      <w:r>
+        <w:drawing>
+          <wp:inline xmlns:a="http://schemas.openxmlformats.org/drawingml/2006/main" xmlns:pic="http://schemas.openxmlformats.org/drawingml/2006/picture">
+            <wp:extent cx="6355080" cy="3574732"/>
+            <wp:docPr id="1" name="Picture 1"/>
+            <wp:cNvGraphicFramePr>
+              <a:graphicFrameLocks noChangeAspect="1"/>
+            </wp:cNvGraphicFramePr>
+            <a:graphic>
+              <a:graphicData uri="http://schemas.openxmlformats.org/drawingml/2006/picture">
+                <pic:pic>
+                  <pic:nvPicPr>
+                    <pic:cNvPr id="0" name="ops-00-dashboard.png"/>
+                    <pic:cNvPicPr/>
+                  </pic:nvPicPr>
+                  <pic:blipFill>
+                    <a:blip r:embed="rId11"/>
+                    <a:stretch>
+                      <a:fillRect/>
+                    </a:stretch>
+                  </pic:blipFill>
+                  <pic:spPr>
+                    <a:xfrm>
+                      <a:off x="0" y="0"/>
+                      <a:ext cx="6355080" cy="3574732"/>
+                    </a:xfrm>
+                    <a:prstGeom prst="rect"/>
+                  </pic:spPr>
+                </pic:pic>
+              </a:graphicData>
+            </a:graphic>
+          </wp:inline>
+        </w:drawing>
+      </w:r>
+    </w:p>
+    <w:p>
+      <w:pPr>
+        <w:pStyle w:val="Caption"/>
+        <w:jc w:val="center"/>
+      </w:pPr>
+      <w:r>
+        <w:t>图 0-1  运营后台总体界面与运营总览</w:t>
       </w:r>
     </w:p>
     <w:p>

</xml_diff>

<commit_message>
docs: publish expanded operations PRDs
</commit_message>
<xml_diff>
--- a/operations-requirements/downloads/00_总纲与研发分工 PRD.docx
+++ b/operations-requirements/downloads/00_总纲与研发分工 PRD.docx
@@ -38,7 +38,7 @@
           <w:color w:val="2E74B5"/>
           <w:sz w:val="20"/>
         </w:rPr>
-        <w:t>OS-OPS-PRD-00  |  V2.0  |  2026-09-08</w:t>
+        <w:t>OS-OPS-PRD-00  |  V2.2  |  2026-09-09</w:t>
       </w:r>
     </w:p>
     <w:p>
@@ -235,6 +235,64 @@
                 <w:color w:val="1F2937"/>
                 <w:sz w:val="18"/>
               </w:rPr>
+              <w:t>界面说明</w:t>
+            </w:r>
+          </w:p>
+        </w:tc>
+        <w:tc>
+          <w:tcPr>
+            <w:tcW w:type="dxa" w:w="7920"/>
+            <w:tcMar>
+              <w:top w:w="75" w:type="dxa"/>
+              <w:start w:w="100" w:type="dxa"/>
+              <w:bottom w:w="75" w:type="dxa"/>
+              <w:end w:w="100" w:type="dxa"/>
+            </w:tcMar>
+            <w:vAlign w:val="center"/>
+          </w:tcPr>
+          <w:p>
+            <w:pPr>
+              <w:spacing w:after="0" w:line="259" w:lineRule="auto"/>
+            </w:pPr>
+            <w:r>
+              <w:rPr>
+                <w:rFonts w:ascii="Calibri" w:hAnsi="Calibri" w:eastAsia="Microsoft YaHei"/>
+                <w:b w:val="0"/>
+                <w:color w:val="1F2937"/>
+                <w:sz w:val="18"/>
+              </w:rPr>
+              <w:t>真实原型截图、页面区域、对应功能点、交互状态和权限态</w:t>
+            </w:r>
+          </w:p>
+        </w:tc>
+      </w:tr>
+      <w:tr>
+        <w:trPr>
+          <w:cantSplit/>
+        </w:trPr>
+        <w:tc>
+          <w:tcPr>
+            <w:tcW w:type="dxa" w:w="2304"/>
+            <w:tcMar>
+              <w:top w:w="75" w:type="dxa"/>
+              <w:start w:w="100" w:type="dxa"/>
+              <w:bottom w:w="75" w:type="dxa"/>
+              <w:end w:w="100" w:type="dxa"/>
+            </w:tcMar>
+            <w:vAlign w:val="center"/>
+            <w:shd w:fill="F4F7FB"/>
+          </w:tcPr>
+          <w:p>
+            <w:pPr>
+              <w:spacing w:after="0" w:line="259" w:lineRule="auto"/>
+            </w:pPr>
+            <w:r>
+              <w:rPr>
+                <w:rFonts w:ascii="Calibri" w:hAnsi="Calibri" w:eastAsia="Microsoft YaHei"/>
+                <w:b w:val="0"/>
+                <w:color w:val="1F2937"/>
+                <w:sz w:val="18"/>
+              </w:rPr>
               <w:t>页面结构</w:t>
             </w:r>
           </w:p>
@@ -249,6 +307,7 @@
               <w:end w:w="100" w:type="dxa"/>
             </w:tcMar>
             <w:vAlign w:val="center"/>
+            <w:shd w:fill="F4F7FB"/>
           </w:tcPr>
           <w:p>
             <w:pPr>
@@ -280,7 +339,6 @@
               <w:end w:w="100" w:type="dxa"/>
             </w:tcMar>
             <w:vAlign w:val="center"/>
-            <w:shd w:fill="F4F7FB"/>
           </w:tcPr>
           <w:p>
             <w:pPr>
@@ -307,7 +365,6 @@
               <w:end w:w="100" w:type="dxa"/>
             </w:tcMar>
             <w:vAlign w:val="center"/>
-            <w:shd w:fill="F4F7FB"/>
           </w:tcPr>
           <w:p>
             <w:pPr>
@@ -339,6 +396,7 @@
               <w:end w:w="100" w:type="dxa"/>
             </w:tcMar>
             <w:vAlign w:val="center"/>
+            <w:shd w:fill="F4F7FB"/>
           </w:tcPr>
           <w:p>
             <w:pPr>
@@ -365,6 +423,7 @@
               <w:end w:w="100" w:type="dxa"/>
             </w:tcMar>
             <w:vAlign w:val="center"/>
+            <w:shd w:fill="F4F7FB"/>
           </w:tcPr>
           <w:p>
             <w:pPr>
@@ -396,7 +455,6 @@
               <w:end w:w="100" w:type="dxa"/>
             </w:tcMar>
             <w:vAlign w:val="center"/>
-            <w:shd w:fill="F4F7FB"/>
           </w:tcPr>
           <w:p>
             <w:pPr>
@@ -409,7 +467,7 @@
                 <w:color w:val="1F2937"/>
                 <w:sz w:val="18"/>
               </w:rPr>
-              <w:t>操作</w:t>
+              <w:t>功能点设计</w:t>
             </w:r>
           </w:p>
         </w:tc>
@@ -423,7 +481,6 @@
               <w:end w:w="100" w:type="dxa"/>
             </w:tcMar>
             <w:vAlign w:val="center"/>
-            <w:shd w:fill="F4F7FB"/>
           </w:tcPr>
           <w:p>
             <w:pPr>
@@ -436,7 +493,7 @@
                 <w:color w:val="1F2937"/>
                 <w:sz w:val="18"/>
               </w:rPr>
-              <w:t>入口、前置条件、步骤、事务、副作用和失败处理</w:t>
+              <w:t>逐功能写明入口、角色、前置、界面步骤、系统处理、规则、结果、异常、跨端影响和验收</w:t>
             </w:r>
           </w:p>
         </w:tc>
@@ -455,6 +512,7 @@
               <w:end w:w="100" w:type="dxa"/>
             </w:tcMar>
             <w:vAlign w:val="center"/>
+            <w:shd w:fill="F4F7FB"/>
           </w:tcPr>
           <w:p>
             <w:pPr>
@@ -481,6 +539,7 @@
               <w:end w:w="100" w:type="dxa"/>
             </w:tcMar>
             <w:vAlign w:val="center"/>
+            <w:shd w:fill="F4F7FB"/>
           </w:tcPr>
           <w:p>
             <w:pPr>
@@ -512,7 +571,6 @@
               <w:end w:w="100" w:type="dxa"/>
             </w:tcMar>
             <w:vAlign w:val="center"/>
-            <w:shd w:fill="F4F7FB"/>
           </w:tcPr>
           <w:p>
             <w:pPr>
@@ -539,7 +597,6 @@
               <w:end w:w="100" w:type="dxa"/>
             </w:tcMar>
             <w:vAlign w:val="center"/>
-            <w:shd w:fill="F4F7FB"/>
           </w:tcPr>
           <w:p>
             <w:pPr>
@@ -571,6 +628,7 @@
               <w:end w:w="100" w:type="dxa"/>
             </w:tcMar>
             <w:vAlign w:val="center"/>
+            <w:shd w:fill="F4F7FB"/>
           </w:tcPr>
           <w:p>
             <w:pPr>
@@ -597,6 +655,7 @@
               <w:end w:w="100" w:type="dxa"/>
             </w:tcMar>
             <w:vAlign w:val="center"/>
+            <w:shd w:fill="F4F7FB"/>
           </w:tcPr>
           <w:p>
             <w:pPr>
@@ -5556,6 +5615,14 @@
         <w:pStyle w:val="ListBullet"/>
       </w:pPr>
       <w:r>
+        <w:t>每个功能点具备独立编号，并在真实原型截图后标明对应关系和界面交互</w:t>
+      </w:r>
+    </w:p>
+    <w:p>
+      <w:pPr>
+        <w:pStyle w:val="ListBullet"/>
+      </w:pPr>
+      <w:r>
         <w:t>字段字典与实际页面、接口Schema和导出列一致</w:t>
       </w:r>
     </w:p>
@@ -5617,7 +5684,7 @@
         <w:color w:val="667085"/>
         <w:sz w:val="15"/>
       </w:rPr>
-      <w:t xml:space="preserve">V2.0  |  2026-09-08  |  </w:t>
+      <w:t xml:space="preserve">V2.2  |  2026-09-09  |  </w:t>
     </w:r>
     <w:r>
       <w:fldChar w:fldCharType="begin"/>

</xml_diff>

<commit_message>
docs: publish operation form screenshots
</commit_message>
<xml_diff>
--- a/operations-requirements/downloads/00_总纲与研发分工 PRD.docx
+++ b/operations-requirements/downloads/00_总纲与研发分工 PRD.docx
@@ -38,7 +38,7 @@
           <w:color w:val="2E74B5"/>
           <w:sz w:val="20"/>
         </w:rPr>
-        <w:t>OS-OPS-PRD-00  |  V2.2  |  2026-09-09</w:t>
+        <w:t>OS-OPS-PRD-00  |  V2.3  |  2026-09-09</w:t>
       </w:r>
     </w:p>
     <w:p>
@@ -5684,7 +5684,7 @@
         <w:color w:val="667085"/>
         <w:sz w:val="15"/>
       </w:rPr>
-      <w:t xml:space="preserve">V2.2  |  2026-09-09  |  </w:t>
+      <w:t xml:space="preserve">V2.3  |  2026-09-09  |  </w:t>
     </w:r>
     <w:r>
       <w:fldChar w:fldCharType="begin"/>

</xml_diff>

<commit_message>
docs: publish localized PRD terminology
</commit_message>
<xml_diff>
--- a/operations-requirements/downloads/00_总纲与研发分工 PRD.docx
+++ b/operations-requirements/downloads/00_总纲与研发分工 PRD.docx
@@ -57,9 +57,7 @@
       </w:r>
     </w:p>
     <w:p>
-      <w:r>
-        <w:br w:type="page"/>
-      </w:r>
+      <w:r/>
     </w:p>
     <w:p>
       <w:pPr>
@@ -92,40 +90,7 @@
         <w:keepNext/>
         <w:jc w:val="center"/>
       </w:pPr>
-      <w:r>
-        <w:drawing>
-          <wp:inline xmlns:a="http://schemas.openxmlformats.org/drawingml/2006/main" xmlns:pic="http://schemas.openxmlformats.org/drawingml/2006/picture">
-            <wp:extent cx="6355080" cy="3574732"/>
-            <wp:docPr id="1" name="Picture 1"/>
-            <wp:cNvGraphicFramePr>
-              <a:graphicFrameLocks noChangeAspect="1"/>
-            </wp:cNvGraphicFramePr>
-            <a:graphic>
-              <a:graphicData uri="http://schemas.openxmlformats.org/drawingml/2006/picture">
-                <pic:pic>
-                  <pic:nvPicPr>
-                    <pic:cNvPr id="0" name="ops-00-dashboard.png"/>
-                    <pic:cNvPicPr/>
-                  </pic:nvPicPr>
-                  <pic:blipFill>
-                    <a:blip r:embed="rId11"/>
-                    <a:stretch>
-                      <a:fillRect/>
-                    </a:stretch>
-                  </pic:blipFill>
-                  <pic:spPr>
-                    <a:xfrm>
-                      <a:off x="0" y="0"/>
-                      <a:ext cx="6355080" cy="3574732"/>
-                    </a:xfrm>
-                    <a:prstGeom prst="rect"/>
-                  </pic:spPr>
-                </pic:pic>
-              </a:graphicData>
-            </a:graphic>
-          </wp:inline>
-        </w:drawing>
-      </w:r>
+      <w:r/>
     </w:p>
     <w:p>
       <w:pPr>
@@ -4728,7 +4693,7 @@
         <w:pStyle w:val="ListBullet"/>
       </w:pPr>
       <w:r>
-        <w:t>所有写操作使用clientRequestId和expectedVersion</w:t>
+        <w:t>所有写操作使用客户端请求编号和预期数据版本</w:t>
       </w:r>
     </w:p>
     <w:p>
@@ -4736,7 +4701,7 @@
         <w:pStyle w:val="ListBullet"/>
       </w:pPr>
       <w:r>
-        <w:t>跨端深链打开后重新校验登录、数据范围、对象状态和allowedActions</w:t>
+        <w:t>跨端深链打开后重新校验登录、数据范围、对象状态和当前允许操作</w:t>
       </w:r>
     </w:p>
     <w:p>

</xml_diff>